<commit_message>
feat: add template_mant_laptop.docx to backend resources
</commit_message>
<xml_diff>
--- a/backend/resources/template_mant_laptop.docx
+++ b/backend/resources/template_mant_laptop.docx
@@ -1147,16 +1147,14 @@
               </w:rPr>
               <w:t xml:space="preserve">• Verificación de los componentes internos; </w:t>
             </w:r>
-            <w:proofErr w:type="spellStart"/>
-            <w:r>
-              <w:rPr>
-                <w:rFonts w:ascii="Arial" w:eastAsia="Arial" w:hAnsi="Arial" w:cs="Arial"/>
-                <w:sz w:val="18"/>
-                <w:szCs w:val="18"/>
-              </w:rPr>
-              <w:t>renovacion</w:t>
-            </w:r>
-            <w:proofErr w:type="spellEnd"/>
+            <w:r>
+              <w:rPr>
+                <w:rFonts w:ascii="Arial" w:eastAsia="Arial" w:hAnsi="Arial" w:cs="Arial"/>
+                <w:sz w:val="18"/>
+                <w:szCs w:val="18"/>
+              </w:rPr>
+              <w:t>renovación</w:t>
+            </w:r>
             <w:r>
               <w:rPr>
                 <w:rFonts w:ascii="Arial" w:eastAsia="Arial" w:hAnsi="Arial" w:cs="Arial"/>
@@ -1165,16 +1163,14 @@
               </w:rPr>
               <w:t xml:space="preserve"> de pasta </w:t>
             </w:r>
-            <w:proofErr w:type="spellStart"/>
-            <w:r>
-              <w:rPr>
-                <w:rFonts w:ascii="Arial" w:eastAsia="Arial" w:hAnsi="Arial" w:cs="Arial"/>
-                <w:sz w:val="18"/>
-                <w:szCs w:val="18"/>
-              </w:rPr>
-              <w:t>termica</w:t>
-            </w:r>
-            <w:proofErr w:type="spellEnd"/>
+            <w:r>
+              <w:rPr>
+                <w:rFonts w:ascii="Arial" w:eastAsia="Arial" w:hAnsi="Arial" w:cs="Arial"/>
+                <w:sz w:val="18"/>
+                <w:szCs w:val="18"/>
+              </w:rPr>
+              <w:t>térmica</w:t>
+            </w:r>
           </w:p>
         </w:tc>
       </w:tr>
@@ -1661,16 +1657,14 @@
               </w:rPr>
               <w:t xml:space="preserve">Mediante la presente dejo constancia que el </w:t>
             </w:r>
-            <w:proofErr w:type="gramStart"/>
-            <w:r>
-              <w:rPr>
-                <w:rFonts w:ascii="Arial" w:eastAsia="Arial" w:hAnsi="Arial" w:cs="Arial"/>
-                <w:sz w:val="18"/>
-                <w:szCs w:val="18"/>
-              </w:rPr>
-              <w:t>equipo(</w:t>
-            </w:r>
-            <w:proofErr w:type="gramEnd"/>
+            <w:r>
+              <w:rPr>
+                <w:rFonts w:ascii="Arial" w:eastAsia="Arial" w:hAnsi="Arial" w:cs="Arial"/>
+                <w:sz w:val="18"/>
+                <w:szCs w:val="18"/>
+              </w:rPr>
+              <w:t>equipo (</w:t>
+            </w:r>
             <w:r>
               <w:rPr>
                 <w:rFonts w:ascii="Arial" w:eastAsia="Arial" w:hAnsi="Arial" w:cs="Arial"/>
@@ -1721,7 +1715,75 @@
             </w:tcMar>
             <w:vAlign w:val="center"/>
           </w:tcPr>
-          <w:p/>
+          <w:p>
+            <w:r>
+              <w:rPr>
+                <w:noProof/>
+              </w:rPr>
+              <w:drawing>
+                <wp:anchor distT="0" distB="0" distL="114300" distR="114300" simplePos="0" relativeHeight="251661312" behindDoc="0" locked="0" layoutInCell="1" allowOverlap="1" wp14:anchorId="58D76E6A" wp14:editId="33887CDA">
+                  <wp:simplePos x="0" y="0"/>
+                  <wp:positionH relativeFrom="column">
+                    <wp:posOffset>4019550</wp:posOffset>
+                  </wp:positionH>
+                  <wp:positionV relativeFrom="paragraph">
+                    <wp:posOffset>-409575</wp:posOffset>
+                  </wp:positionV>
+                  <wp:extent cx="1844675" cy="1383030"/>
+                  <wp:effectExtent l="0" t="0" r="0" b="0"/>
+                  <wp:wrapNone/>
+                  <wp:docPr id="751942345" name="Picture 1"/>
+                  <wp:cNvGraphicFramePr>
+                    <a:graphicFrameLocks xmlns:a="http://schemas.openxmlformats.org/drawingml/2006/main" noChangeAspect="1"/>
+                  </wp:cNvGraphicFramePr>
+                  <a:graphic xmlns:a="http://schemas.openxmlformats.org/drawingml/2006/main">
+                    <a:graphicData uri="http://schemas.openxmlformats.org/drawingml/2006/picture">
+                      <pic:pic xmlns:pic="http://schemas.openxmlformats.org/drawingml/2006/picture">
+                        <pic:nvPicPr>
+                          <pic:cNvPr id="0" name="Picture 1"/>
+                          <pic:cNvPicPr>
+                            <a:picLocks noChangeAspect="1" noChangeArrowheads="1"/>
+                          </pic:cNvPicPr>
+                        </pic:nvPicPr>
+                        <pic:blipFill>
+                          <a:blip r:embed="rId9" cstate="print">
+                            <a:extLst>
+                              <a:ext uri="{28A0092B-C50C-407E-A947-70E740481C1C}">
+                                <a14:useLocalDpi xmlns:a14="http://schemas.microsoft.com/office/drawing/2010/main" val="0"/>
+                              </a:ext>
+                            </a:extLst>
+                          </a:blip>
+                          <a:srcRect/>
+                          <a:stretch>
+                            <a:fillRect/>
+                          </a:stretch>
+                        </pic:blipFill>
+                        <pic:spPr bwMode="auto">
+                          <a:xfrm>
+                            <a:off x="0" y="0"/>
+                            <a:ext cx="1844675" cy="1383030"/>
+                          </a:xfrm>
+                          <a:prstGeom prst="rect">
+                            <a:avLst/>
+                          </a:prstGeom>
+                          <a:noFill/>
+                          <a:ln>
+                            <a:noFill/>
+                          </a:ln>
+                        </pic:spPr>
+                      </pic:pic>
+                    </a:graphicData>
+                  </a:graphic>
+                  <wp14:sizeRelH relativeFrom="margin">
+                    <wp14:pctWidth>0</wp14:pctWidth>
+                  </wp14:sizeRelH>
+                  <wp14:sizeRelV relativeFrom="margin">
+                    <wp14:pctHeight>0</wp14:pctHeight>
+                  </wp14:sizeRelV>
+                </wp:anchor>
+              </w:drawing>
+            </w:r>
+          </w:p>
         </w:tc>
       </w:tr>
       <w:tr>

</xml_diff>